<commit_message>
Deploying to gh-pages from @ ucdavis/win@054caacb7a4f24bc614cf25f35c90fd34bafe2bf 🚀
</commit_message>
<xml_diff>
--- a/chapters/02-randomized-experiments.docx
+++ b/chapters/02-randomized-experiments.docx
@@ -8083,6 +8083,9 @@
                 <m:t>]</m:t>
               </m:r>
             </m:oMath>
+            <w:r>
+              <w:t xml:space="preserve">​</w:t>
+            </w:r>
           </w:p>
         </w:tc>
         <w:tc>
@@ -8226,6 +8229,9 @@
                 </m:e>
               </m:d>
             </m:oMath>
+            <w:r>
+              <w:t xml:space="preserve">​</w:t>
+            </w:r>
           </w:p>
         </w:tc>
       </w:tr>

</xml_diff>